<commit_message>
addition of refs, terms etc.
</commit_message>
<xml_diff>
--- a/custom-reference.docx
+++ b/custom-reference.docx
@@ -399,10 +399,21 @@
         <w:rPr>
           <w:rStyle w:val="VerbatimChar"/>
         </w:rPr>
-        <w:t xml:space="preserve"> Verbatim Char </w:t>
-      </w:r>
-      <w:r>
-        <w:t xml:space="preserve"> .   </w:t>
+        <w:t xml:space="preserve"> Verbatim </w:t>
+      </w:r>
+      <w:proofErr w:type="gramStart"/>
+      <w:r>
+        <w:rPr>
+          <w:rStyle w:val="VerbatimChar"/>
+        </w:rPr>
+        <w:t xml:space="preserve">Char </w:t>
+      </w:r>
+      <w:r>
+        <w:t xml:space="preserve"> .</w:t>
+      </w:r>
+      <w:proofErr w:type="gramEnd"/>
+      <w:r>
+        <w:t xml:space="preserve">   </w:t>
       </w:r>
       <w:hyperlink r:id="rId7">
         <w:r>
@@ -440,7 +451,7 @@
     </w:p>
     <w:tbl>
       <w:tblPr>
-        <w:tblStyle w:val="Table"/>
+        <w:tblStyle w:val="TableGridLight"/>
         <w:tblW w:w="0" w:type="auto"/>
         <w:tblLook w:val="07E0" w:firstRow="1" w:lastRow="1" w:firstColumn="1" w:lastColumn="1" w:noHBand="1" w:noVBand="1"/>
       </w:tblPr>
@@ -449,9 +460,6 @@
         <w:gridCol w:w="831"/>
       </w:tblGrid>
       <w:tr>
-        <w:trPr>
-          <w:cnfStyle w:val="100000000000" w:firstRow="1" w:lastRow="0" w:firstColumn="0" w:lastColumn="0" w:oddVBand="0" w:evenVBand="0" w:oddHBand="0" w:evenHBand="0" w:firstRowFirstColumn="0" w:firstRowLastColumn="0" w:lastRowFirstColumn="0" w:lastRowLastColumn="0"/>
-        </w:trPr>
         <w:tc>
           <w:tcPr>
             <w:tcW w:w="0" w:type="auto"/>
@@ -1686,6 +1694,24 @@
       <w:spacing w:after="100"/>
       <w:ind w:left="480"/>
     </w:pPr>
+  </w:style>
+  <w:style w:type="table" w:styleId="TableGridLight">
+    <w:name w:val="Grid Table Light"/>
+    <w:basedOn w:val="TableNormal"/>
+    <w:rsid w:val="003C715E"/>
+    <w:pPr>
+      <w:spacing w:after="0"/>
+    </w:pPr>
+    <w:tblPr>
+      <w:tblBorders>
+        <w:top w:val="single" w:sz="4" w:space="0" w:color="BFBFBF" w:themeColor="background1" w:themeShade="BF"/>
+        <w:left w:val="single" w:sz="4" w:space="0" w:color="BFBFBF" w:themeColor="background1" w:themeShade="BF"/>
+        <w:bottom w:val="single" w:sz="4" w:space="0" w:color="BFBFBF" w:themeColor="background1" w:themeShade="BF"/>
+        <w:right w:val="single" w:sz="4" w:space="0" w:color="BFBFBF" w:themeColor="background1" w:themeShade="BF"/>
+        <w:insideH w:val="single" w:sz="4" w:space="0" w:color="BFBFBF" w:themeColor="background1" w:themeShade="BF"/>
+        <w:insideV w:val="single" w:sz="4" w:space="0" w:color="BFBFBF" w:themeColor="background1" w:themeShade="BF"/>
+      </w:tblBorders>
+    </w:tblPr>
   </w:style>
 </w:styles>
 </file>

</xml_diff>

<commit_message>
Fix of note blocks in docx output.
</commit_message>
<xml_diff>
--- a/custom-reference.docx
+++ b/custom-reference.docx
@@ -1712,6 +1712,18 @@
         <w:insideV w:val="single" w:sz="4" w:space="0" w:color="BFBFBF" w:themeColor="background1" w:themeShade="BF"/>
       </w:tblBorders>
     </w:tblPr>
+  </w:style>
+  <w:style w:type="paragraph" w:customStyle="1" w:styleId="Note">
+    <w:name w:val="Note"/>
+    <w:basedOn w:val="BodyText"/>
+    <w:pPr>
+      <w:pBdr>
+        <w:left w:val="single" w:sz="24" w:space="6" w:color="4472C4"/>
+      </w:pBdr>
+      <w:shd w:val="clear" w:color="auto" w:fill="EEF3FB"/>
+      <w:ind w:left="360"/>
+      <w:spacing w:before="60" w:after="60"/>
+    </w:pPr>
   </w:style>
 </w:styles>
 </file>

</xml_diff>

<commit_message>
update of docx template.
</commit_message>
<xml_diff>
--- a/custom-reference.docx
+++ b/custom-reference.docx
@@ -1091,8 +1091,12 @@
     <w:pPr>
       <w:keepNext/>
       <w:keepLines/>
-      <w:spacing w:before="80" w:after="40"/>
+      <w:spacing w:before="240" w:after="120"/>
       <w:outlineLvl w:val="3"/>
+      <w:ind w:left="1440" w:hanging="1440"/>
+      <w:tabs>
+        <w:tab w:val="left" w:pos="1440"/>
+      </w:tabs>
     </w:pPr>
     <w:rPr>
       <w:rFonts w:eastAsiaTheme="majorEastAsia" w:cstheme="majorBidi"/>
@@ -1551,6 +1555,14 @@
         <w:bottom w:w="0" w:type="dxa"/>
         <w:right w:w="108" w:type="dxa"/>
       </w:tblCellMar>
+      <w:tblBorders>
+        <w:top w:val="single" w:sz="4" w:space="0" w:color="000000"/>
+        <w:left w:val="single" w:sz="4" w:space="0" w:color="000000"/>
+        <w:bottom w:val="single" w:sz="4" w:space="0" w:color="000000"/>
+        <w:right w:val="single" w:sz="4" w:space="0" w:color="000000"/>
+        <w:insideH w:val="single" w:sz="4" w:space="0" w:color="000000"/>
+        <w:insideV w:val="single" w:sz="4" w:space="0" w:color="000000"/>
+      </w:tblBorders>
     </w:tblPr>
     <w:tblStylePr w:type="firstRow">
       <w:tblPr>

</xml_diff>

<commit_message>
Changes to address AS review comments.
</commit_message>
<xml_diff>
--- a/custom-reference.docx
+++ b/custom-reference.docx
@@ -39,7 +39,7 @@
         <w:pStyle w:val="Abstract"/>
       </w:pPr>
       <w:r>
-        <w:t xml:space="preserve"> Abstract </w:t>
+        <w:t xml:space="preserve">Abstract </w:t>
       </w:r>
     </w:p>
     <w:p>
@@ -271,35 +271,30 @@
         <w:pStyle w:val="Heading1"/>
       </w:pPr>
       <w:bookmarkStart w:id="0" w:name="heading-1"/>
+      <w:bookmarkStart w:id="1" w:name="_Toc210810257"/>
+      <w:r>
+        <w:lastRenderedPageBreak/>
+        <w:t>Heading 1</w:t>
+      </w:r>
+      <w:bookmarkEnd w:id="1"/>
       <w:r>
         <w:t xml:space="preserve"> </w:t>
       </w:r>
-      <w:bookmarkStart w:id="1" w:name="_Toc210810257"/>
-      <w:r>
-        <w:t>Heading 1</w:t>
-      </w:r>
-      <w:bookmarkEnd w:id="1"/>
+      <w:bookmarkEnd w:id="0"/>
+    </w:p>
+    <w:p>
+      <w:pPr>
+        <w:pStyle w:val="Heading2"/>
+      </w:pPr>
+      <w:bookmarkStart w:id="2" w:name="heading-2"/>
+      <w:bookmarkStart w:id="3" w:name="_Toc210810258"/>
+      <w:r>
+        <w:t>Heading 2</w:t>
+      </w:r>
+      <w:bookmarkEnd w:id="3"/>
       <w:r>
         <w:t xml:space="preserve"> </w:t>
       </w:r>
-      <w:bookmarkEnd w:id="0"/>
-    </w:p>
-    <w:p>
-      <w:pPr>
-        <w:pStyle w:val="Heading2"/>
-      </w:pPr>
-      <w:bookmarkStart w:id="2" w:name="heading-2"/>
-      <w:r>
-        <w:t xml:space="preserve"> </w:t>
-      </w:r>
-      <w:bookmarkStart w:id="3" w:name="_Toc210810258"/>
-      <w:r>
-        <w:t>Heading 2</w:t>
-      </w:r>
-      <w:bookmarkEnd w:id="3"/>
-      <w:r>
-        <w:t xml:space="preserve"> </w:t>
-      </w:r>
       <w:bookmarkEnd w:id="2"/>
     </w:p>
     <w:p>
@@ -307,9 +302,6 @@
         <w:pStyle w:val="Heading3"/>
       </w:pPr>
       <w:bookmarkStart w:id="4" w:name="heading-3"/>
-      <w:r>
-        <w:t xml:space="preserve"> </w:t>
-      </w:r>
       <w:bookmarkStart w:id="5" w:name="_Toc210810259"/>
       <w:r>
         <w:t>Heading 3</w:t>
@@ -399,21 +391,10 @@
         <w:rPr>
           <w:rStyle w:val="VerbatimChar"/>
         </w:rPr>
-        <w:t xml:space="preserve"> Verbatim </w:t>
-      </w:r>
-      <w:proofErr w:type="gramStart"/>
-      <w:r>
-        <w:rPr>
-          <w:rStyle w:val="VerbatimChar"/>
-        </w:rPr>
-        <w:t xml:space="preserve">Char </w:t>
-      </w:r>
-      <w:r>
-        <w:t xml:space="preserve"> .</w:t>
-      </w:r>
-      <w:proofErr w:type="gramEnd"/>
-      <w:r>
-        <w:t xml:space="preserve">   </w:t>
+        <w:t xml:space="preserve"> Verbatim Char </w:t>
+      </w:r>
+      <w:r>
+        <w:t xml:space="preserve"> .   </w:t>
       </w:r>
       <w:hyperlink r:id="rId7">
         <w:r>
@@ -456,8 +437,8 @@
         <w:tblLook w:val="07E0" w:firstRow="1" w:lastRow="1" w:firstColumn="1" w:lastColumn="1" w:noHBand="1" w:noVBand="1"/>
       </w:tblPr>
       <w:tblGrid>
-        <w:gridCol w:w="831"/>
-        <w:gridCol w:w="831"/>
+        <w:gridCol w:w="829"/>
+        <w:gridCol w:w="829"/>
       </w:tblGrid>
       <w:tr>
         <w:tc>
@@ -545,7 +526,6 @@
         <w:pStyle w:val="DefinitionTerm"/>
       </w:pPr>
       <w:r>
-        <w:lastRenderedPageBreak/>
         <w:t xml:space="preserve"> DefinitionTerm </w:t>
       </w:r>
     </w:p>
@@ -1009,6 +989,11 @@
   <w:style w:type="paragraph" w:default="1" w:styleId="Normal">
     <w:name w:val="Normal"/>
     <w:qFormat/>
+    <w:rsid w:val="00764993"/>
+    <w:rPr>
+      <w:rFonts w:ascii="Verdana" w:hAnsi="Verdana"/>
+      <w:sz w:val="20"/>
+    </w:rPr>
   </w:style>
   <w:style w:type="paragraph" w:styleId="Heading1">
     <w:name w:val="heading 1"/>
@@ -1017,16 +1002,16 @@
     <w:link w:val="Heading1Char"/>
     <w:uiPriority w:val="9"/>
     <w:qFormat/>
-    <w:rsid w:val="00A10FD9"/>
+    <w:rsid w:val="00764993"/>
     <w:pPr>
       <w:keepNext/>
       <w:keepLines/>
+      <w:pageBreakBefore/>
       <w:spacing w:before="360" w:after="80"/>
       <w:outlineLvl w:val="0"/>
-      <w:pageBreakBefore w:val="1"/>
-    </w:pPr>
-    <w:rPr>
-      <w:rFonts w:asciiTheme="majorHAnsi" w:eastAsiaTheme="majorEastAsia" w:hAnsiTheme="majorHAnsi" w:cstheme="majorBidi"/>
+    </w:pPr>
+    <w:rPr>
+      <w:rFonts w:eastAsiaTheme="majorEastAsia" w:cstheme="majorBidi"/>
       <w:color w:val="0F4761" w:themeColor="accent1" w:themeShade="BF"/>
       <w:sz w:val="40"/>
       <w:szCs w:val="40"/>
@@ -1041,7 +1026,7 @@
     <w:semiHidden/>
     <w:unhideWhenUsed/>
     <w:qFormat/>
-    <w:rsid w:val="00A10FD9"/>
+    <w:rsid w:val="00764993"/>
     <w:pPr>
       <w:keepNext/>
       <w:keepLines/>
@@ -1049,7 +1034,7 @@
       <w:outlineLvl w:val="1"/>
     </w:pPr>
     <w:rPr>
-      <w:rFonts w:asciiTheme="majorHAnsi" w:eastAsiaTheme="majorEastAsia" w:hAnsiTheme="majorHAnsi" w:cstheme="majorBidi"/>
+      <w:rFonts w:eastAsiaTheme="majorEastAsia" w:cstheme="majorBidi"/>
       <w:color w:val="0F4761" w:themeColor="accent1" w:themeShade="BF"/>
       <w:sz w:val="32"/>
       <w:szCs w:val="32"/>
@@ -1091,12 +1076,12 @@
     <w:pPr>
       <w:keepNext/>
       <w:keepLines/>
-      <w:spacing w:before="240" w:after="120"/>
-      <w:outlineLvl w:val="3"/>
-      <w:ind w:left="1440" w:hanging="1440"/>
       <w:tabs>
         <w:tab w:val="left" w:pos="1440"/>
       </w:tabs>
+      <w:spacing w:before="240" w:after="120"/>
+      <w:ind w:left="1440" w:hanging="1440"/>
+      <w:outlineLvl w:val="3"/>
     </w:pPr>
     <w:rPr>
       <w:rFonts w:eastAsiaTheme="majorEastAsia" w:cstheme="majorBidi"/>
@@ -1368,7 +1353,6 @@
     </w:pPr>
     <w:rPr>
       <w:b/>
-      <w:sz w:val="20"/>
       <w:szCs w:val="20"/>
     </w:rPr>
   </w:style>
@@ -1383,7 +1367,6 @@
       <w:spacing w:before="100" w:after="300"/>
     </w:pPr>
     <w:rPr>
-      <w:sz w:val="20"/>
       <w:szCs w:val="20"/>
     </w:rPr>
   </w:style>
@@ -1397,9 +1380,9 @@
     <w:basedOn w:val="DefaultParagraphFont"/>
     <w:link w:val="Heading1"/>
     <w:uiPriority w:val="9"/>
-    <w:rsid w:val="00A10FD9"/>
-    <w:rPr>
-      <w:rFonts w:asciiTheme="majorHAnsi" w:eastAsiaTheme="majorEastAsia" w:hAnsiTheme="majorHAnsi" w:cstheme="majorBidi"/>
+    <w:rsid w:val="00764993"/>
+    <w:rPr>
+      <w:rFonts w:ascii="Verdana" w:eastAsiaTheme="majorEastAsia" w:hAnsi="Verdana" w:cstheme="majorBidi"/>
       <w:color w:val="0F4761" w:themeColor="accent1" w:themeShade="BF"/>
       <w:sz w:val="40"/>
       <w:szCs w:val="40"/>
@@ -1411,9 +1394,9 @@
     <w:link w:val="Heading2"/>
     <w:uiPriority w:val="9"/>
     <w:semiHidden/>
-    <w:rsid w:val="00A10FD9"/>
-    <w:rPr>
-      <w:rFonts w:asciiTheme="majorHAnsi" w:eastAsiaTheme="majorEastAsia" w:hAnsiTheme="majorHAnsi" w:cstheme="majorBidi"/>
+    <w:rsid w:val="00764993"/>
+    <w:rPr>
+      <w:rFonts w:ascii="Verdana" w:eastAsiaTheme="majorEastAsia" w:hAnsi="Verdana" w:cstheme="majorBidi"/>
       <w:color w:val="0F4761" w:themeColor="accent1" w:themeShade="BF"/>
       <w:sz w:val="32"/>
       <w:szCs w:val="32"/>
@@ -1549,12 +1532,6 @@
     <w:qFormat/>
     <w:tblPr>
       <w:tblInd w:w="0" w:type="dxa"/>
-      <w:tblCellMar>
-        <w:top w:w="0" w:type="dxa"/>
-        <w:left w:w="108" w:type="dxa"/>
-        <w:bottom w:w="0" w:type="dxa"/>
-        <w:right w:w="108" w:type="dxa"/>
-      </w:tblCellMar>
       <w:tblBorders>
         <w:top w:val="single" w:sz="4" w:space="0" w:color="000000"/>
         <w:left w:val="single" w:sz="4" w:space="0" w:color="000000"/>
@@ -1563,6 +1540,12 @@
         <w:insideH w:val="single" w:sz="4" w:space="0" w:color="000000"/>
         <w:insideV w:val="single" w:sz="4" w:space="0" w:color="000000"/>
       </w:tblBorders>
+      <w:tblCellMar>
+        <w:top w:w="0" w:type="dxa"/>
+        <w:left w:w="108" w:type="dxa"/>
+        <w:bottom w:w="0" w:type="dxa"/>
+        <w:right w:w="108" w:type="dxa"/>
+      </w:tblCellMar>
     </w:tblPr>
     <w:tblStylePr w:type="firstRow">
       <w:tblPr>
@@ -1734,9 +1717,27 @@
         <w:left w:val="single" w:sz="24" w:space="6" w:color="4472C4"/>
       </w:pBdr>
       <w:shd w:val="clear" w:color="auto" w:fill="EEF3FB"/>
+      <w:spacing w:before="60" w:after="60"/>
       <w:ind w:left="360"/>
-      <w:spacing w:before="60" w:after="60"/>
-    </w:pPr>
+    </w:pPr>
+  </w:style>
+  <w:style w:type="paragraph" w:customStyle="1" w:styleId="SourceCode">
+    <w:name w:val="Source Code"/>
+    <w:pPr>
+      <w:pBdr>
+        <w:top w:val="single" w:sz="6" w:space="2" w:color="808080"/>
+        <w:left w:val="single" w:sz="6" w:space="4" w:color="808080"/>
+        <w:bottom w:val="single" w:sz="6" w:space="2" w:color="808080"/>
+        <w:right w:val="single" w:sz="6" w:space="4" w:color="808080"/>
+      </w:pBdr>
+      <w:shd w:val="clear" w:color="auto" w:fill="F4F4F4"/>
+      <w:spacing w:before="80" w:after="80"/>
+      <w:ind w:left="90" w:right="90"/>
+    </w:pPr>
+    <w:rPr>
+      <w:rFonts w:ascii="Courier New" w:hAnsi="Courier New"/>
+      <w:sz w:val="18"/>
+    </w:rPr>
   </w:style>
 </w:styles>
 </file>

</xml_diff>